<commit_message>
Convert Week 6 doc to bullet points throughout; remove pitch video script section
</commit_message>
<xml_diff>
--- a/Health_First_Week6_Submission.docx
+++ b/Health_First_Week6_Submission.docx
@@ -43,18 +43,77 @@
     </w:p>
     <w:p>
       <w:pPr>
-        <w:spacing w:after="160"/>
+        <w:pStyle w:val="ListBullet"/>
+        <w:spacing w:after="80"/>
       </w:pPr>
       <w:r>
-        <w:t>Health First is a habit-formation app for kids: daily health goals (water, movement, sleep, fruit) bank screen-time minutes as they're completed. Finish everything and the day's entertainment apps unlock without limit. A parent dashboard handles review, goal setup, and a PIN-gated emergency override.</w:t>
+        <w:rPr>
+          <w:b/>
+        </w:rPr>
+        <w:t>What it is —</w:t>
+      </w:r>
+      <w:r>
+        <w:t xml:space="preserve"> a habit-formation app for kids — daily health goals (water, movement, sleep, fruit) bank screen-time minutes as they're completed.</w:t>
       </w:r>
     </w:p>
     <w:p>
       <w:pPr>
-        <w:spacing w:after="160"/>
+        <w:pStyle w:val="ListBullet"/>
+        <w:spacing w:after="80"/>
       </w:pPr>
       <w:r>
-        <w:t>The problem it solves: kids skip daily health habits because they get distracted and nothing holds them accountable. Week 4 user research showed this isn't just a kid problem — family members confirmed they forget these habits too — which is why the app is built around an encouraging, repeatable loop rather than a punitive control feature.</w:t>
+        <w:rPr>
+          <w:b/>
+        </w:rPr>
+        <w:t>The payoff —</w:t>
+      </w:r>
+      <w:r>
+        <w:t xml:space="preserve"> finish every goal and the day's entertainment apps (Games, YouTube) unlock without limit.</w:t>
+      </w:r>
+    </w:p>
+    <w:p>
+      <w:pPr>
+        <w:pStyle w:val="ListBullet"/>
+        <w:spacing w:after="80"/>
+      </w:pPr>
+      <w:r>
+        <w:rPr>
+          <w:b/>
+        </w:rPr>
+        <w:t>For parents —</w:t>
+      </w:r>
+      <w:r>
+        <w:t xml:space="preserve"> a dashboard for review, goal setup, and a PIN-gated emergency override.</w:t>
+      </w:r>
+    </w:p>
+    <w:p>
+      <w:pPr>
+        <w:pStyle w:val="ListBullet"/>
+        <w:spacing w:after="80"/>
+      </w:pPr>
+      <w:r>
+        <w:rPr>
+          <w:b/>
+        </w:rPr>
+        <w:t>The problem —</w:t>
+      </w:r>
+      <w:r>
+        <w:t xml:space="preserve"> kids skip daily health habits because they get distracted and nothing holds them accountable.</w:t>
+      </w:r>
+    </w:p>
+    <w:p>
+      <w:pPr>
+        <w:pStyle w:val="ListBullet"/>
+        <w:spacing w:after="80"/>
+      </w:pPr>
+      <w:r>
+        <w:rPr>
+          <w:b/>
+        </w:rPr>
+        <w:t>Why this design —</w:t>
+      </w:r>
+      <w:r>
+        <w:t xml:space="preserve"> Week 4 user research showed this isn't just a kid problem — family members confirmed they forget these habits too — so the app is built around an encouraging, repeatable loop rather than a punitive control feature.</w:t>
       </w:r>
     </w:p>
     <w:p>
@@ -259,10 +318,47 @@
     </w:p>
     <w:p>
       <w:pPr>
-        <w:spacing w:after="160"/>
+        <w:pStyle w:val="ListBullet"/>
+        <w:spacing w:after="80"/>
       </w:pPr>
       <w:r>
-        <w:t>Health First is a single self-contained HTML/CSS/JS file with no build step and no backend — all state (goals, streaks, minute balance, history) persists in the browser's localStorage, keyed per day with an automatic daily rollover. The UI is a re-render-on-state-change pattern: every user action mutates a central state object, then redraws the current view. This kept the prototype fast to iterate on across five weeks of refinement without any infrastructure to manage.</w:t>
+        <w:rPr>
+          <w:b/>
+        </w:rPr>
+        <w:t>Single-file app —</w:t>
+      </w:r>
+      <w:r>
+        <w:t xml:space="preserve"> a single self-contained HTML/CSS/JS file — no build step, no backend, no dependencies.</w:t>
+      </w:r>
+    </w:p>
+    <w:p>
+      <w:pPr>
+        <w:pStyle w:val="ListBullet"/>
+        <w:spacing w:after="80"/>
+      </w:pPr>
+      <w:r>
+        <w:rPr>
+          <w:b/>
+        </w:rPr>
+        <w:t>State persistence —</w:t>
+      </w:r>
+      <w:r>
+        <w:t xml:space="preserve"> goals, streaks, minute balance, and history all persist in the browser's localStorage, keyed per day with an automatic daily rollover.</w:t>
+      </w:r>
+    </w:p>
+    <w:p>
+      <w:pPr>
+        <w:pStyle w:val="ListBullet"/>
+        <w:spacing w:after="80"/>
+      </w:pPr>
+      <w:r>
+        <w:rPr>
+          <w:b/>
+        </w:rPr>
+        <w:t>Re-render on change —</w:t>
+      </w:r>
+      <w:r>
+        <w:t xml:space="preserve"> every user action mutates a central state object, then redraws the current view — kept the prototype fast to iterate on across five weeks of refinement without any infrastructure to manage.</w:t>
       </w:r>
     </w:p>
     <w:p>
@@ -280,10 +376,47 @@
     </w:p>
     <w:p>
       <w:pPr>
-        <w:spacing w:after="160"/>
+        <w:pStyle w:val="ListBullet"/>
+        <w:spacing w:after="80"/>
       </w:pPr>
       <w:r>
-        <w:t>A family interview (Week 4) confirmed the core problem generalizes beyond kids, which shaped the reward design: an all-or-nothing lock was rejected in favor of per-goal minute banking, so partial effort is always rewarded while finishing everything is still the biggest win. Manual end-to-end walk-throughs of every path (photo proof, PIN proof, parent approve/reject, emergency unlock, goal add/remove, and the screen-time countdown) found no incomplete flows going into this final week.</w:t>
+        <w:rPr>
+          <w:b/>
+        </w:rPr>
+        <w:t>The finding —</w:t>
+      </w:r>
+      <w:r>
+        <w:t xml:space="preserve"> a family interview (Week 4) confirmed the core problem generalizes beyond kids, not just a kid-specific issue.</w:t>
+      </w:r>
+    </w:p>
+    <w:p>
+      <w:pPr>
+        <w:pStyle w:val="ListBullet"/>
+        <w:spacing w:after="80"/>
+      </w:pPr>
+      <w:r>
+        <w:rPr>
+          <w:b/>
+        </w:rPr>
+        <w:t>The design response —</w:t>
+      </w:r>
+      <w:r>
+        <w:t xml:space="preserve"> an all-or-nothing lock was rejected in favor of per-goal minute banking, so partial effort is always rewarded while finishing everything is still the biggest win.</w:t>
+      </w:r>
+    </w:p>
+    <w:p>
+      <w:pPr>
+        <w:pStyle w:val="ListBullet"/>
+        <w:spacing w:after="80"/>
+      </w:pPr>
+      <w:r>
+        <w:rPr>
+          <w:b/>
+        </w:rPr>
+        <w:t>Testing coverage —</w:t>
+      </w:r>
+      <w:r>
+        <w:t xml:space="preserve"> manual end-to-end walk-throughs of every path (photo proof, PIN proof, parent approve/reject, emergency unlock, goal add/remove, and the screen-time countdown) found no incomplete flows going into this final week.</w:t>
       </w:r>
     </w:p>
     <w:p>
@@ -301,127 +434,32 @@
     </w:p>
     <w:p>
       <w:pPr>
-        <w:spacing w:after="160"/>
+        <w:pStyle w:val="ListBullet"/>
+        <w:spacing w:after="80"/>
       </w:pPr>
       <w:r>
-        <w:t>Live prototype: https://claude.ai/code/artifact/dc777afc-bb3e-408c-aede-89ed91983bd3  (Demo Parent PIN: 1234)</w:t>
+        <w:rPr>
+          <w:b/>
+        </w:rPr>
+        <w:t xml:space="preserve">Live prototype — </w:t>
+      </w:r>
+      <w:r>
+        <w:t xml:space="preserve"> https://claude.ai/code/artifact/dc777afc-bb3e-408c-aede-89ed91983bd3 (Demo Parent PIN: 1234)</w:t>
       </w:r>
     </w:p>
     <w:p>
       <w:pPr>
-        <w:spacing w:after="160"/>
-      </w:pPr>
-      <w:r>
-        <w:t>Source code &amp; all weekly documentation: https://github.com/sahil19891989/health-first</w:t>
-      </w:r>
-    </w:p>
-    <w:p>
-      <w:pPr>
-        <w:spacing w:before="360" w:after="120"/>
+        <w:pStyle w:val="ListBullet"/>
+        <w:spacing w:after="80"/>
       </w:pPr>
       <w:r>
         <w:rPr>
           <w:b/>
-          <w:color w:val="2E5A44"/>
-          <w:sz w:val="30"/>
         </w:rPr>
-        <w:t>6. Pitch Video Script (60–90 seconds)</w:t>
+        <w:t xml:space="preserve">GitHub repo — </w:t>
       </w:r>
-    </w:p>
-    <w:p>
-      <w:pPr>
-        <w:spacing w:after="160"/>
-      </w:pPr>
       <w:r>
-        <w:rPr>
-          <w:i/>
-          <w:color w:val="5B6A5F"/>
-        </w:rPr>
-        <w:t>Read this straight into the camera/screen recording — timings are approximate.</w:t>
-      </w:r>
-    </w:p>
-    <w:p>
-      <w:pPr>
-        <w:spacing w:before="200" w:after="80"/>
-      </w:pPr>
-      <w:r>
-        <w:rPr>
-          <w:b/>
-          <w:color w:val="1F2D22"/>
-          <w:sz w:val="24"/>
-        </w:rPr>
-        <w:t>Hook (0:00–0:10)</w:t>
-      </w:r>
-    </w:p>
-    <w:p>
-      <w:pPr>
-        <w:spacing w:after="160"/>
-      </w:pPr>
-      <w:r>
-        <w:t>“Kids skip daily health habits — drinking water, sleeping on time — because nothing holds them accountable. And it turns out it's not just a kid problem: when we asked our own family, they admitted they forget too.”</w:t>
-      </w:r>
-    </w:p>
-    <w:p>
-      <w:pPr>
-        <w:spacing w:before="200" w:after="80"/>
-      </w:pPr>
-      <w:r>
-        <w:rPr>
-          <w:b/>
-          <w:color w:val="1F2D22"/>
-          <w:sz w:val="24"/>
-        </w:rPr>
-        <w:t>Solution (0:10–0:30)</w:t>
-      </w:r>
-    </w:p>
-    <w:p>
-      <w:pPr>
-        <w:spacing w:after="160"/>
-      </w:pPr>
-      <w:r>
-        <w:t>“Health First turns that into a game. A kid gets a daily checklist — water, movement, sleep, fruit. Each goal they finish — by photo or a parent's PIN — banks them screen-time minutes. Finish everything, and the whole day opens up.”</w:t>
-      </w:r>
-    </w:p>
-    <w:p>
-      <w:pPr>
-        <w:spacing w:before="200" w:after="80"/>
-      </w:pPr>
-      <w:r>
-        <w:rPr>
-          <w:b/>
-          <w:color w:val="1F2D22"/>
-          <w:sz w:val="24"/>
-        </w:rPr>
-        <w:t>Demo (0:30–1:00)</w:t>
-      </w:r>
-    </w:p>
-    <w:p>
-      <w:pPr>
-        <w:spacing w:after="160"/>
-      </w:pPr>
-      <w:r>
-        <w:t>“Watch: I tap through a goal, confirm it with the parent PIN, and it instantly banks 15 minutes — you can see it right here on the Games and YouTube tiles. If I tap in, it starts a real countdown, and warns me before time runs out. And a parent can add their own goals, set the reward minutes, or hit emergency unlock if they genuinely need to.”</w:t>
-      </w:r>
-    </w:p>
-    <w:p>
-      <w:pPr>
-        <w:spacing w:before="200" w:after="80"/>
-      </w:pPr>
-      <w:r>
-        <w:rPr>
-          <w:b/>
-          <w:color w:val="1F2D22"/>
-          <w:sz w:val="24"/>
-        </w:rPr>
-        <w:t>Close (1:00–1:15)</w:t>
-      </w:r>
-    </w:p>
-    <w:p>
-      <w:pPr>
-        <w:spacing w:after="160"/>
-      </w:pPr>
-      <w:r>
-        <w:t>“We built this from a Week 1 blueprint through five weeks of real refinement — including fixing a bug where the Sleep goal couldn't be rewarded same-day at all. Health First: making healthy habits the actual price of screen time.”</w:t>
+        <w:t xml:space="preserve"> https://github.com/sahil19891989/health-first (source code and all weekly documentation)</w:t>
       </w:r>
     </w:p>
     <w:sectPr>

</xml_diff>

<commit_message>
Update README, Week 6 doc, and pitch deck to describe the parent-review-queue + bulk-approve workflow
</commit_message>
<xml_diff>
--- a/Health_First_Week6_Submission.docx
+++ b/Health_First_Week6_Submission.docx
@@ -169,7 +169,22 @@
         <w:t>Two-path proof —</w:t>
       </w:r>
       <w:r>
-        <w:t xml:space="preserve"> upload a photo (queued for parent review with a mock AI check) or confirm on the spot with a parent PIN.</w:t>
+        <w:t xml:space="preserve"> upload a photo, or ask a parent with a note — both land in a parent review queue rather than an on-the-spot PIN prompt on the kid's screen.</w:t>
+      </w:r>
+    </w:p>
+    <w:p>
+      <w:pPr>
+        <w:pStyle w:val="ListBullet"/>
+        <w:spacing w:after="80"/>
+      </w:pPr>
+      <w:r>
+        <w:rPr>
+          <w:b/>
+        </w:rPr>
+        <w:t>Bulk approve —</w:t>
+      </w:r>
+      <w:r>
+        <w:t xml:space="preserve"> a parent can approve every waiting goal in one PIN entry instead of one at a time.</w:t>
       </w:r>
     </w:p>
     <w:p>
@@ -416,7 +431,7 @@
         <w:t>Testing coverage —</w:t>
       </w:r>
       <w:r>
-        <w:t xml:space="preserve"> manual end-to-end walk-throughs of every path (photo proof, PIN proof, parent approve/reject, emergency unlock, goal add/remove, and the screen-time countdown) found no incomplete flows going into this final week.</w:t>
+        <w:t xml:space="preserve"> manual end-to-end walk-throughs of every path (photo proof, ask-parent proof, individual and bulk approve/reject, emergency unlock, goal add/remove, and the screen-time countdown) found no incomplete flows going into this final week.</w:t>
       </w:r>
     </w:p>
     <w:p>

</xml_diff>